<commit_message>
feat(document): ajouter les fonctions de formatage de text
</commit_message>
<xml_diff>
--- a/documents_templates/cotations-secondary.docx
+++ b/documents_templates/cotations-secondary.docx
@@ -19,17 +19,114 @@
     <w:p>
       <w:pPr>
         <w:pStyle w:val="Normal"/>
+        <w:spacing w:before="0" w:after="0"/>
         <w:jc w:val="center"/>
         <w:rPr>
-          <w:sz w:val="22"/>
-          <w:szCs w:val="22"/>
+          <w:b/>
+          <w:bCs/>
+          <w:sz w:val="20"/>
+          <w:szCs w:val="20"/>
         </w:rPr>
       </w:pPr>
       <w:r>
+        <mc:AlternateContent>
+          <mc:Choice Requires="wps">
+            <w:drawing>
+              <wp:anchor behindDoc="0" distT="0" distB="0" distL="0" distR="0" simplePos="0" locked="0" layoutInCell="1" allowOverlap="1" relativeHeight="2">
+                <wp:simplePos x="0" y="0"/>
+                <wp:positionH relativeFrom="column">
+                  <wp:posOffset>-68580</wp:posOffset>
+                </wp:positionH>
+                <wp:positionV relativeFrom="paragraph">
+                  <wp:posOffset>-57785</wp:posOffset>
+                </wp:positionV>
+                <wp:extent cx="679450" cy="567055"/>
+                <wp:effectExtent l="635" t="1270" r="635" b="0"/>
+                <wp:wrapNone/>
+                <wp:docPr id="1" name="Forme 1"/>
+                <a:graphic xmlns:a="http://schemas.openxmlformats.org/drawingml/2006/main">
+                  <a:graphicData uri="http://schemas.microsoft.com/office/word/2010/wordprocessingShape">
+                    <wps:wsp>
+                      <wps:cNvSpPr/>
+                      <wps:spPr>
+                        <a:xfrm>
+                          <a:off x="0" y="0"/>
+                          <a:ext cx="679320" cy="567000"/>
+                        </a:xfrm>
+                        <a:prstGeom prst="rect">
+                          <a:avLst/>
+                        </a:prstGeom>
+                        <a:blipFill rotWithShape="0">
+                          <a:blip r:embed="rId2"/>
+                          <a:tile tx="0" ty="0" sx="100000" sy="100000" algn="ctr"/>
+                        </a:blipFill>
+                        <a:ln w="0">
+                          <a:solidFill>
+                            <a:srgbClr val="3465a4"/>
+                          </a:solidFill>
+                        </a:ln>
+                      </wps:spPr>
+                      <wps:style>
+                        <a:lnRef idx="0"/>
+                        <a:fillRef idx="0"/>
+                        <a:effectRef idx="0"/>
+                        <a:fontRef idx="minor"/>
+                      </wps:style>
+                      <wps:txbx>
+                        <w:txbxContent>
+                          <w:p>
+                            <w:pPr>
+                              <w:pStyle w:val="Contenudecadre"/>
+                              <w:spacing w:before="0" w:after="160"/>
+                              <w:rPr/>
+                            </w:pPr>
+                            <w:r>
+                              <w:rPr/>
+                            </w:r>
+                          </w:p>
+                        </w:txbxContent>
+                      </wps:txbx>
+                      <wps:bodyPr lIns="0" rIns="0" tIns="0" bIns="0" anchor="ctr">
+                        <a:noAutofit/>
+                      </wps:bodyPr>
+                    </wps:wsp>
+                  </a:graphicData>
+                </a:graphic>
+              </wp:anchor>
+            </w:drawing>
+          </mc:Choice>
+          <mc:Fallback>
+            <w:pict>
+              <v:rect id="shape_0" ID="Forme 1" stroked="t" o:allowincell="f" style="position:absolute;margin-left:-5.4pt;margin-top:-4.55pt;width:53.45pt;height:44.6pt;mso-wrap-style:none;v-text-anchor:middle">
+                <v:fill r:id="rId3" o:detectmouseclick="t" type="tile" color2="black"/>
+                <v:stroke color="#3465a4" joinstyle="round" endcap="flat"/>
+                <v:textbox>
+                  <w:txbxContent>
+                    <w:p>
+                      <w:pPr>
+                        <w:pStyle w:val="Contenudecadre"/>
+                        <w:spacing w:before="0" w:after="160"/>
+                        <w:rPr/>
+                      </w:pPr>
+                      <w:r>
+                        <w:rPr/>
+                      </w:r>
+                    </w:p>
+                  </w:txbxContent>
+                </v:textbox>
+                <w10:wrap type="none"/>
+              </v:rect>
+            </w:pict>
+          </mc:Fallback>
+        </mc:AlternateContent>
+      </w:r>
+      <w:r>
         <w:rPr>
           <w:rFonts w:cs="Times New Roman" w:ascii="Times New Roman" w:hAnsi="Times New Roman"/>
-          <w:sz w:val="22"/>
-          <w:szCs w:val="22"/>
+          <w:b/>
+          <w:bCs/>
+          <w:sz w:val="20"/>
+          <w:szCs w:val="20"/>
         </w:rPr>
         <w:t>REPUBLIQUE DEMOCRATIQUE DU CONGO</w:t>
       </w:r>
@@ -37,11 +134,9 @@
     <w:p>
       <w:pPr>
         <w:pStyle w:val="Normal"/>
+        <w:spacing w:before="0" w:after="0"/>
         <w:jc w:val="center"/>
-        <w:rPr>
-          <w:sz w:val="18"/>
-          <w:szCs w:val="18"/>
-        </w:rPr>
+        <w:rPr/>
       </w:pPr>
       <w:r>
         <w:rPr>
@@ -55,20 +150,83 @@
     <w:p>
       <w:pPr>
         <w:pStyle w:val="Normal"/>
+        <w:spacing w:before="57" w:after="57"/>
         <w:jc w:val="center"/>
         <w:rPr>
-          <w:rFonts w:ascii="Times New Roman" w:hAnsi="Times New Roman" w:cs="Times New Roman"/>
-          <w:b/>
-          <w:sz w:val="24"/>
+          <w:sz w:val="22"/>
+          <w:szCs w:val="22"/>
         </w:rPr>
       </w:pPr>
       <w:r>
         <w:rPr>
           <w:rFonts w:cs="Times New Roman" w:ascii="Times New Roman" w:hAnsi="Times New Roman"/>
           <w:b/>
-          <w:sz w:val="24"/>
+          <w:sz w:val="22"/>
+          <w:szCs w:val="22"/>
         </w:rPr>
-        <w:t>+++school.name+++</w:t>
+        <w:t>+++</w:t>
+      </w:r>
+      <w:r>
+        <w:rPr>
+          <w:rFonts w:cs="Times New Roman" w:ascii="Times New Roman" w:hAnsi="Times New Roman"/>
+          <w:b/>
+          <w:sz w:val="22"/>
+          <w:szCs w:val="22"/>
+        </w:rPr>
+        <w:t>upper(school.name)</w:t>
+      </w:r>
+      <w:r>
+        <w:rPr>
+          <w:rFonts w:cs="Times New Roman" w:ascii="Times New Roman" w:hAnsi="Times New Roman"/>
+          <w:b/>
+          <w:sz w:val="22"/>
+          <w:szCs w:val="22"/>
+        </w:rPr>
+        <w:t>+++</w:t>
+      </w:r>
+    </w:p>
+    <w:p>
+      <w:pPr>
+        <w:pStyle w:val="Normal"/>
+        <w:spacing w:before="0" w:after="0"/>
+        <w:jc w:val="center"/>
+        <w:rPr>
+          <w:i/>
+          <w:i/>
+          <w:iCs/>
+          <w:sz w:val="18"/>
+          <w:szCs w:val="18"/>
+        </w:rPr>
+      </w:pPr>
+      <w:r>
+        <w:rPr>
+          <w:rFonts w:cs="Times New Roman" w:ascii="Times New Roman" w:hAnsi="Times New Roman"/>
+          <w:i/>
+          <w:iCs/>
+          <w:sz w:val="18"/>
+          <w:szCs w:val="18"/>
+        </w:rPr>
+        <w:t>+++school.adress++</w:t>
+      </w:r>
+      <w:r>
+        <w:rPr>
+          <w:rFonts w:cs="Times New Roman" w:ascii="Times New Roman" w:hAnsi="Times New Roman"/>
+          <w:i/>
+          <w:iCs/>
+          <w:sz w:val="18"/>
+          <w:szCs w:val="18"/>
+        </w:rPr>
+        <w:t>+</w:t>
+      </w:r>
+      <w:r>
+        <w:rPr>
+          <w:rFonts w:cs="Times New Roman" w:ascii="Times New Roman" w:hAnsi="Times New Roman"/>
+          <w:i/>
+          <w:iCs/>
+          <w:sz w:val="18"/>
+          <w:szCs w:val="18"/>
+        </w:rPr>
+        <w:t>, +++school.town+++</w:t>
       </w:r>
     </w:p>
     <w:p>
@@ -77,32 +235,13 @@
         <w:jc w:val="center"/>
         <w:rPr>
           <w:rFonts w:ascii="Times New Roman" w:hAnsi="Times New Roman" w:cs="Times New Roman"/>
-          <w:sz w:val="20"/>
         </w:rPr>
       </w:pPr>
       <w:r>
         <w:rPr>
-          <w:rFonts w:cs="Times New Roman" w:ascii="Times New Roman" w:hAnsi="Times New Roman"/>
-          <w:sz w:val="20"/>
+          <w:sz w:val="18"/>
+          <w:szCs w:val="18"/>
         </w:rPr>
-        <w:t>+++school.adress+++</w:t>
-      </w:r>
-    </w:p>
-    <w:p>
-      <w:pPr>
-        <w:pStyle w:val="Normal"/>
-        <w:jc w:val="center"/>
-        <w:rPr>
-          <w:rFonts w:ascii="Times New Roman" w:hAnsi="Times New Roman" w:cs="Times New Roman"/>
-          <w:sz w:val="20"/>
-        </w:rPr>
-      </w:pPr>
-      <w:r>
-        <w:rPr>
-          <w:rFonts w:cs="Times New Roman" w:ascii="Times New Roman" w:hAnsi="Times New Roman"/>
-          <w:sz w:val="20"/>
-        </w:rPr>
-        <w:t>+++school.town+++</w:t>
       </w:r>
     </w:p>
     <w:tbl>
@@ -428,14 +567,15 @@
         </w:pBdr>
         <w:jc w:val="center"/>
         <w:rPr>
-          <w:rFonts w:ascii="Times New Roman" w:hAnsi="Times New Roman" w:cs="Times New Roman"/>
-          <w:sz w:val="24"/>
+          <w:sz w:val="22"/>
+          <w:szCs w:val="22"/>
         </w:rPr>
       </w:pPr>
       <w:r>
         <w:rPr>
           <w:rFonts w:cs="Times New Roman" w:ascii="Times New Roman" w:hAnsi="Times New Roman"/>
-          <w:sz w:val="24"/>
+          <w:sz w:val="22"/>
+          <w:szCs w:val="22"/>
         </w:rPr>
         <w:t xml:space="preserve">FICHE DE COTATION | </w:t>
       </w:r>
@@ -443,35 +583,52 @@
         <w:rPr>
           <w:rFonts w:cs="Times New Roman" w:ascii="Times New Roman" w:hAnsi="Times New Roman"/>
           <w:b/>
+          <w:sz w:val="22"/>
+          <w:szCs w:val="22"/>
         </w:rPr>
-        <w:t>+++$classroom.shortIdentifier+++</w:t>
+        <w:t>+++</w:t>
       </w:r>
       <w:r>
         <w:rPr>
           <w:rFonts w:cs="Times New Roman" w:ascii="Times New Roman" w:hAnsi="Times New Roman"/>
+          <w:b/>
+          <w:sz w:val="22"/>
+          <w:szCs w:val="22"/>
         </w:rPr>
-        <w:t xml:space="preserve"> </w:t>
+        <w:t>$classroom.shortIdentifier</w:t>
       </w:r>
       <w:r>
         <w:rPr>
           <w:rFonts w:cs="Times New Roman" w:ascii="Times New Roman" w:hAnsi="Times New Roman"/>
-          <w:sz w:val="24"/>
+          <w:b/>
+          <w:sz w:val="22"/>
+          <w:szCs w:val="22"/>
         </w:rPr>
-        <w:t xml:space="preserve"> | +++</w:t>
+        <w:t>+++</w:t>
       </w:r>
       <w:r>
         <w:rPr>
           <w:rFonts w:cs="Times New Roman" w:ascii="Times New Roman" w:hAnsi="Times New Roman"/>
-          <w:sz w:val="20"/>
+          <w:sz w:val="22"/>
+          <w:szCs w:val="22"/>
         </w:rPr>
-        <w:t>school</w:t>
+        <w:t xml:space="preserve">  | +++</w:t>
       </w:r>
       <w:r>
         <w:rPr>
           <w:rFonts w:cs="Times New Roman" w:ascii="Times New Roman" w:hAnsi="Times New Roman"/>
-          <w:sz w:val="24"/>
+          <w:sz w:val="22"/>
+          <w:szCs w:val="22"/>
         </w:rPr>
-        <w:t>.studyYear.yearName+++</w:t>
+        <w:t>upper(school.studyYear.yearName)</w:t>
+      </w:r>
+      <w:r>
+        <w:rPr>
+          <w:rFonts w:cs="Times New Roman" w:ascii="Times New Roman" w:hAnsi="Times New Roman"/>
+          <w:sz w:val="22"/>
+          <w:szCs w:val="22"/>
+        </w:rPr>
+        <w:t>+++</w:t>
       </w:r>
     </w:p>
     <w:tbl>
@@ -493,14 +650,14 @@
         <w:gridCol w:w="683"/>
         <w:gridCol w:w="2909"/>
         <w:gridCol w:w="532"/>
-        <w:gridCol w:w="519"/>
+        <w:gridCol w:w="520"/>
         <w:gridCol w:w="937"/>
         <w:gridCol w:w="682"/>
-        <w:gridCol w:w="503"/>
-        <w:gridCol w:w="503"/>
+        <w:gridCol w:w="502"/>
+        <w:gridCol w:w="504"/>
         <w:gridCol w:w="937"/>
         <w:gridCol w:w="682"/>
-        <w:gridCol w:w="681"/>
+        <w:gridCol w:w="680"/>
       </w:tblGrid>
       <w:tr>
         <w:trPr/>
@@ -572,7 +729,7 @@
         </w:tc>
         <w:tc>
           <w:tcPr>
-            <w:tcW w:w="2670" w:type="dxa"/>
+            <w:tcW w:w="2671" w:type="dxa"/>
             <w:gridSpan w:val="4"/>
             <w:tcBorders>
               <w:left w:val="single" w:sz="18" w:space="0" w:color="000000"/>
@@ -684,7 +841,7 @@
         </w:tc>
         <w:tc>
           <w:tcPr>
-            <w:tcW w:w="681" w:type="dxa"/>
+            <w:tcW w:w="680" w:type="dxa"/>
             <w:vMerge w:val="restart"/>
             <w:tcBorders>
               <w:left w:val="single" w:sz="18" w:space="0" w:color="000000"/>
@@ -846,7 +1003,7 @@
         </w:tc>
         <w:tc>
           <w:tcPr>
-            <w:tcW w:w="519" w:type="dxa"/>
+            <w:tcW w:w="520" w:type="dxa"/>
             <w:tcBorders/>
             <w:vAlign w:val="center"/>
           </w:tcPr>
@@ -962,7 +1119,7 @@
         </w:tc>
         <w:tc>
           <w:tcPr>
-            <w:tcW w:w="503" w:type="dxa"/>
+            <w:tcW w:w="502" w:type="dxa"/>
             <w:tcBorders>
               <w:left w:val="single" w:sz="18" w:space="0" w:color="000000"/>
             </w:tcBorders>
@@ -1016,7 +1173,7 @@
         </w:tc>
         <w:tc>
           <w:tcPr>
-            <w:tcW w:w="503" w:type="dxa"/>
+            <w:tcW w:w="504" w:type="dxa"/>
             <w:tcBorders/>
             <w:vAlign w:val="center"/>
           </w:tcPr>
@@ -1132,7 +1289,7 @@
         </w:tc>
         <w:tc>
           <w:tcPr>
-            <w:tcW w:w="681" w:type="dxa"/>
+            <w:tcW w:w="680" w:type="dxa"/>
             <w:vMerge w:val="continue"/>
             <w:tcBorders>
               <w:left w:val="single" w:sz="18" w:space="0" w:color="000000"/>
@@ -1262,7 +1419,7 @@
         </w:tc>
         <w:tc>
           <w:tcPr>
-            <w:tcW w:w="519" w:type="dxa"/>
+            <w:tcW w:w="520" w:type="dxa"/>
             <w:tcBorders>
               <w:bottom w:val="single" w:sz="18" w:space="0" w:color="000000"/>
             </w:tcBorders>
@@ -1353,7 +1510,7 @@
         </w:tc>
         <w:tc>
           <w:tcPr>
-            <w:tcW w:w="503" w:type="dxa"/>
+            <w:tcW w:w="502" w:type="dxa"/>
             <w:tcBorders>
               <w:left w:val="single" w:sz="18" w:space="0" w:color="000000"/>
               <w:bottom w:val="single" w:sz="18" w:space="0" w:color="000000"/>
@@ -1384,7 +1541,7 @@
         </w:tc>
         <w:tc>
           <w:tcPr>
-            <w:tcW w:w="503" w:type="dxa"/>
+            <w:tcW w:w="504" w:type="dxa"/>
             <w:tcBorders>
               <w:bottom w:val="single" w:sz="18" w:space="0" w:color="000000"/>
             </w:tcBorders>
@@ -1475,7 +1632,7 @@
         </w:tc>
         <w:tc>
           <w:tcPr>
-            <w:tcW w:w="681" w:type="dxa"/>
+            <w:tcW w:w="680" w:type="dxa"/>
             <w:tcBorders>
               <w:left w:val="single" w:sz="18" w:space="0" w:color="000000"/>
               <w:bottom w:val="single" w:sz="18" w:space="0" w:color="000000"/>
@@ -1603,7 +1760,7 @@
         </w:tc>
         <w:tc>
           <w:tcPr>
-            <w:tcW w:w="519" w:type="dxa"/>
+            <w:tcW w:w="520" w:type="dxa"/>
             <w:tcBorders>
               <w:top w:val="single" w:sz="18" w:space="0" w:color="000000"/>
             </w:tcBorders>
@@ -1691,7 +1848,7 @@
         </w:tc>
         <w:tc>
           <w:tcPr>
-            <w:tcW w:w="503" w:type="dxa"/>
+            <w:tcW w:w="502" w:type="dxa"/>
             <w:tcBorders>
               <w:top w:val="single" w:sz="18" w:space="0" w:color="000000"/>
               <w:left w:val="single" w:sz="18" w:space="0" w:color="000000"/>
@@ -1721,7 +1878,7 @@
         </w:tc>
         <w:tc>
           <w:tcPr>
-            <w:tcW w:w="503" w:type="dxa"/>
+            <w:tcW w:w="504" w:type="dxa"/>
             <w:tcBorders>
               <w:top w:val="single" w:sz="18" w:space="0" w:color="000000"/>
             </w:tcBorders>
@@ -1809,7 +1966,7 @@
         </w:tc>
         <w:tc>
           <w:tcPr>
-            <w:tcW w:w="681" w:type="dxa"/>
+            <w:tcW w:w="680" w:type="dxa"/>
             <w:tcBorders>
               <w:top w:val="single" w:sz="18" w:space="0" w:color="000000"/>
               <w:left w:val="single" w:sz="18" w:space="0" w:color="000000"/>
@@ -1942,7 +2099,7 @@
         </w:tc>
         <w:tc>
           <w:tcPr>
-            <w:tcW w:w="519" w:type="dxa"/>
+            <w:tcW w:w="520" w:type="dxa"/>
             <w:tcBorders/>
           </w:tcPr>
           <w:p>
@@ -2025,7 +2182,7 @@
         </w:tc>
         <w:tc>
           <w:tcPr>
-            <w:tcW w:w="503" w:type="dxa"/>
+            <w:tcW w:w="502" w:type="dxa"/>
             <w:tcBorders>
               <w:left w:val="single" w:sz="18" w:space="0" w:color="000000"/>
             </w:tcBorders>
@@ -2054,7 +2211,7 @@
         </w:tc>
         <w:tc>
           <w:tcPr>
-            <w:tcW w:w="503" w:type="dxa"/>
+            <w:tcW w:w="504" w:type="dxa"/>
             <w:tcBorders/>
           </w:tcPr>
           <w:p>
@@ -2137,7 +2294,7 @@
         </w:tc>
         <w:tc>
           <w:tcPr>
-            <w:tcW w:w="681" w:type="dxa"/>
+            <w:tcW w:w="680" w:type="dxa"/>
             <w:tcBorders>
               <w:left w:val="single" w:sz="18" w:space="0" w:color="000000"/>
             </w:tcBorders>
@@ -2257,7 +2414,7 @@
         </w:tc>
         <w:tc>
           <w:tcPr>
-            <w:tcW w:w="519" w:type="dxa"/>
+            <w:tcW w:w="520" w:type="dxa"/>
             <w:tcBorders/>
           </w:tcPr>
           <w:p>
@@ -2340,7 +2497,7 @@
         </w:tc>
         <w:tc>
           <w:tcPr>
-            <w:tcW w:w="503" w:type="dxa"/>
+            <w:tcW w:w="502" w:type="dxa"/>
             <w:tcBorders>
               <w:left w:val="single" w:sz="18" w:space="0" w:color="000000"/>
             </w:tcBorders>
@@ -2369,7 +2526,7 @@
         </w:tc>
         <w:tc>
           <w:tcPr>
-            <w:tcW w:w="503" w:type="dxa"/>
+            <w:tcW w:w="504" w:type="dxa"/>
             <w:tcBorders/>
           </w:tcPr>
           <w:p>
@@ -2452,7 +2609,7 @@
         </w:tc>
         <w:tc>
           <w:tcPr>
-            <w:tcW w:w="681" w:type="dxa"/>
+            <w:tcW w:w="680" w:type="dxa"/>
             <w:tcBorders>
               <w:left w:val="single" w:sz="18" w:space="0" w:color="000000"/>
             </w:tcBorders>
@@ -2574,7 +2731,7 @@
         </w:tc>
         <w:tc>
           <w:tcPr>
-            <w:tcW w:w="519" w:type="dxa"/>
+            <w:tcW w:w="520" w:type="dxa"/>
             <w:tcBorders>
               <w:top w:val="nil"/>
             </w:tcBorders>
@@ -2662,7 +2819,7 @@
         </w:tc>
         <w:tc>
           <w:tcPr>
-            <w:tcW w:w="503" w:type="dxa"/>
+            <w:tcW w:w="502" w:type="dxa"/>
             <w:tcBorders>
               <w:top w:val="nil"/>
               <w:left w:val="single" w:sz="18" w:space="0" w:color="000000"/>
@@ -2692,7 +2849,7 @@
         </w:tc>
         <w:tc>
           <w:tcPr>
-            <w:tcW w:w="503" w:type="dxa"/>
+            <w:tcW w:w="504" w:type="dxa"/>
             <w:tcBorders>
               <w:top w:val="nil"/>
             </w:tcBorders>
@@ -2780,7 +2937,7 @@
         </w:tc>
         <w:tc>
           <w:tcPr>
-            <w:tcW w:w="681" w:type="dxa"/>
+            <w:tcW w:w="680" w:type="dxa"/>
             <w:tcBorders>
               <w:top w:val="nil"/>
               <w:left w:val="single" w:sz="18" w:space="0" w:color="000000"/>
@@ -2903,7 +3060,7 @@
         </w:tc>
         <w:tc>
           <w:tcPr>
-            <w:tcW w:w="519" w:type="dxa"/>
+            <w:tcW w:w="520" w:type="dxa"/>
             <w:tcBorders>
               <w:top w:val="nil"/>
             </w:tcBorders>
@@ -2991,7 +3148,7 @@
         </w:tc>
         <w:tc>
           <w:tcPr>
-            <w:tcW w:w="503" w:type="dxa"/>
+            <w:tcW w:w="502" w:type="dxa"/>
             <w:tcBorders>
               <w:top w:val="nil"/>
               <w:left w:val="single" w:sz="18" w:space="0" w:color="000000"/>
@@ -3021,7 +3178,7 @@
         </w:tc>
         <w:tc>
           <w:tcPr>
-            <w:tcW w:w="503" w:type="dxa"/>
+            <w:tcW w:w="504" w:type="dxa"/>
             <w:tcBorders>
               <w:top w:val="nil"/>
             </w:tcBorders>
@@ -3109,7 +3266,7 @@
         </w:tc>
         <w:tc>
           <w:tcPr>
-            <w:tcW w:w="681" w:type="dxa"/>
+            <w:tcW w:w="680" w:type="dxa"/>
             <w:tcBorders>
               <w:top w:val="nil"/>
               <w:left w:val="single" w:sz="18" w:space="0" w:color="000000"/>
@@ -3232,7 +3389,7 @@
         </w:tc>
         <w:tc>
           <w:tcPr>
-            <w:tcW w:w="519" w:type="dxa"/>
+            <w:tcW w:w="520" w:type="dxa"/>
             <w:tcBorders>
               <w:top w:val="nil"/>
             </w:tcBorders>
@@ -3320,7 +3477,7 @@
         </w:tc>
         <w:tc>
           <w:tcPr>
-            <w:tcW w:w="503" w:type="dxa"/>
+            <w:tcW w:w="502" w:type="dxa"/>
             <w:tcBorders>
               <w:top w:val="nil"/>
               <w:left w:val="single" w:sz="18" w:space="0" w:color="000000"/>
@@ -3350,7 +3507,7 @@
         </w:tc>
         <w:tc>
           <w:tcPr>
-            <w:tcW w:w="503" w:type="dxa"/>
+            <w:tcW w:w="504" w:type="dxa"/>
             <w:tcBorders>
               <w:top w:val="nil"/>
             </w:tcBorders>
@@ -3438,7 +3595,7 @@
         </w:tc>
         <w:tc>
           <w:tcPr>
-            <w:tcW w:w="681" w:type="dxa"/>
+            <w:tcW w:w="680" w:type="dxa"/>
             <w:tcBorders>
               <w:top w:val="nil"/>
               <w:left w:val="single" w:sz="18" w:space="0" w:color="000000"/>
@@ -3561,7 +3718,7 @@
         </w:tc>
         <w:tc>
           <w:tcPr>
-            <w:tcW w:w="519" w:type="dxa"/>
+            <w:tcW w:w="520" w:type="dxa"/>
             <w:tcBorders>
               <w:top w:val="nil"/>
             </w:tcBorders>
@@ -3649,7 +3806,7 @@
         </w:tc>
         <w:tc>
           <w:tcPr>
-            <w:tcW w:w="503" w:type="dxa"/>
+            <w:tcW w:w="502" w:type="dxa"/>
             <w:tcBorders>
               <w:top w:val="nil"/>
               <w:left w:val="single" w:sz="18" w:space="0" w:color="000000"/>
@@ -3679,7 +3836,7 @@
         </w:tc>
         <w:tc>
           <w:tcPr>
-            <w:tcW w:w="503" w:type="dxa"/>
+            <w:tcW w:w="504" w:type="dxa"/>
             <w:tcBorders>
               <w:top w:val="nil"/>
             </w:tcBorders>
@@ -3767,7 +3924,7 @@
         </w:tc>
         <w:tc>
           <w:tcPr>
-            <w:tcW w:w="681" w:type="dxa"/>
+            <w:tcW w:w="680" w:type="dxa"/>
             <w:tcBorders>
               <w:top w:val="nil"/>
               <w:left w:val="single" w:sz="18" w:space="0" w:color="000000"/>
@@ -3890,7 +4047,7 @@
         </w:tc>
         <w:tc>
           <w:tcPr>
-            <w:tcW w:w="519" w:type="dxa"/>
+            <w:tcW w:w="520" w:type="dxa"/>
             <w:tcBorders>
               <w:top w:val="nil"/>
             </w:tcBorders>
@@ -3978,7 +4135,7 @@
         </w:tc>
         <w:tc>
           <w:tcPr>
-            <w:tcW w:w="503" w:type="dxa"/>
+            <w:tcW w:w="502" w:type="dxa"/>
             <w:tcBorders>
               <w:top w:val="nil"/>
               <w:left w:val="single" w:sz="18" w:space="0" w:color="000000"/>
@@ -4008,7 +4165,7 @@
         </w:tc>
         <w:tc>
           <w:tcPr>
-            <w:tcW w:w="503" w:type="dxa"/>
+            <w:tcW w:w="504" w:type="dxa"/>
             <w:tcBorders>
               <w:top w:val="nil"/>
             </w:tcBorders>
@@ -4096,7 +4253,7 @@
         </w:tc>
         <w:tc>
           <w:tcPr>
-            <w:tcW w:w="681" w:type="dxa"/>
+            <w:tcW w:w="680" w:type="dxa"/>
             <w:tcBorders>
               <w:top w:val="nil"/>
               <w:left w:val="single" w:sz="18" w:space="0" w:color="000000"/>
@@ -4219,7 +4376,7 @@
         </w:tc>
         <w:tc>
           <w:tcPr>
-            <w:tcW w:w="519" w:type="dxa"/>
+            <w:tcW w:w="520" w:type="dxa"/>
             <w:tcBorders>
               <w:top w:val="nil"/>
             </w:tcBorders>
@@ -4307,7 +4464,7 @@
         </w:tc>
         <w:tc>
           <w:tcPr>
-            <w:tcW w:w="503" w:type="dxa"/>
+            <w:tcW w:w="502" w:type="dxa"/>
             <w:tcBorders>
               <w:top w:val="nil"/>
               <w:left w:val="single" w:sz="18" w:space="0" w:color="000000"/>
@@ -4337,7 +4494,7 @@
         </w:tc>
         <w:tc>
           <w:tcPr>
-            <w:tcW w:w="503" w:type="dxa"/>
+            <w:tcW w:w="504" w:type="dxa"/>
             <w:tcBorders>
               <w:top w:val="nil"/>
             </w:tcBorders>
@@ -4425,7 +4582,7 @@
         </w:tc>
         <w:tc>
           <w:tcPr>
-            <w:tcW w:w="681" w:type="dxa"/>
+            <w:tcW w:w="680" w:type="dxa"/>
             <w:tcBorders>
               <w:top w:val="nil"/>
               <w:left w:val="single" w:sz="18" w:space="0" w:color="000000"/>
@@ -4548,7 +4705,7 @@
         </w:tc>
         <w:tc>
           <w:tcPr>
-            <w:tcW w:w="519" w:type="dxa"/>
+            <w:tcW w:w="520" w:type="dxa"/>
             <w:tcBorders>
               <w:top w:val="nil"/>
             </w:tcBorders>
@@ -4636,7 +4793,7 @@
         </w:tc>
         <w:tc>
           <w:tcPr>
-            <w:tcW w:w="503" w:type="dxa"/>
+            <w:tcW w:w="502" w:type="dxa"/>
             <w:tcBorders>
               <w:top w:val="nil"/>
               <w:left w:val="single" w:sz="18" w:space="0" w:color="000000"/>
@@ -4666,7 +4823,7 @@
         </w:tc>
         <w:tc>
           <w:tcPr>
-            <w:tcW w:w="503" w:type="dxa"/>
+            <w:tcW w:w="504" w:type="dxa"/>
             <w:tcBorders>
               <w:top w:val="nil"/>
             </w:tcBorders>
@@ -4754,7 +4911,7 @@
         </w:tc>
         <w:tc>
           <w:tcPr>
-            <w:tcW w:w="681" w:type="dxa"/>
+            <w:tcW w:w="680" w:type="dxa"/>
             <w:tcBorders>
               <w:top w:val="nil"/>
               <w:left w:val="single" w:sz="18" w:space="0" w:color="000000"/>
@@ -4877,7 +5034,7 @@
         </w:tc>
         <w:tc>
           <w:tcPr>
-            <w:tcW w:w="519" w:type="dxa"/>
+            <w:tcW w:w="520" w:type="dxa"/>
             <w:tcBorders>
               <w:top w:val="nil"/>
             </w:tcBorders>
@@ -4965,7 +5122,7 @@
         </w:tc>
         <w:tc>
           <w:tcPr>
-            <w:tcW w:w="503" w:type="dxa"/>
+            <w:tcW w:w="502" w:type="dxa"/>
             <w:tcBorders>
               <w:top w:val="nil"/>
               <w:left w:val="single" w:sz="18" w:space="0" w:color="000000"/>
@@ -4995,7 +5152,7 @@
         </w:tc>
         <w:tc>
           <w:tcPr>
-            <w:tcW w:w="503" w:type="dxa"/>
+            <w:tcW w:w="504" w:type="dxa"/>
             <w:tcBorders>
               <w:top w:val="nil"/>
             </w:tcBorders>
@@ -5083,7 +5240,7 @@
         </w:tc>
         <w:tc>
           <w:tcPr>
-            <w:tcW w:w="681" w:type="dxa"/>
+            <w:tcW w:w="680" w:type="dxa"/>
             <w:tcBorders>
               <w:top w:val="nil"/>
               <w:left w:val="single" w:sz="18" w:space="0" w:color="000000"/>
@@ -5206,7 +5363,7 @@
         </w:tc>
         <w:tc>
           <w:tcPr>
-            <w:tcW w:w="519" w:type="dxa"/>
+            <w:tcW w:w="520" w:type="dxa"/>
             <w:tcBorders>
               <w:top w:val="nil"/>
             </w:tcBorders>
@@ -5294,7 +5451,7 @@
         </w:tc>
         <w:tc>
           <w:tcPr>
-            <w:tcW w:w="503" w:type="dxa"/>
+            <w:tcW w:w="502" w:type="dxa"/>
             <w:tcBorders>
               <w:top w:val="nil"/>
               <w:left w:val="single" w:sz="18" w:space="0" w:color="000000"/>
@@ -5324,7 +5481,7 @@
         </w:tc>
         <w:tc>
           <w:tcPr>
-            <w:tcW w:w="503" w:type="dxa"/>
+            <w:tcW w:w="504" w:type="dxa"/>
             <w:tcBorders>
               <w:top w:val="nil"/>
             </w:tcBorders>
@@ -5412,7 +5569,7 @@
         </w:tc>
         <w:tc>
           <w:tcPr>
-            <w:tcW w:w="681" w:type="dxa"/>
+            <w:tcW w:w="680" w:type="dxa"/>
             <w:tcBorders>
               <w:top w:val="nil"/>
               <w:left w:val="single" w:sz="18" w:space="0" w:color="000000"/>
@@ -5535,7 +5692,7 @@
         </w:tc>
         <w:tc>
           <w:tcPr>
-            <w:tcW w:w="519" w:type="dxa"/>
+            <w:tcW w:w="520" w:type="dxa"/>
             <w:tcBorders>
               <w:top w:val="nil"/>
             </w:tcBorders>
@@ -5623,7 +5780,7 @@
         </w:tc>
         <w:tc>
           <w:tcPr>
-            <w:tcW w:w="503" w:type="dxa"/>
+            <w:tcW w:w="502" w:type="dxa"/>
             <w:tcBorders>
               <w:top w:val="nil"/>
               <w:left w:val="single" w:sz="18" w:space="0" w:color="000000"/>
@@ -5653,7 +5810,7 @@
         </w:tc>
         <w:tc>
           <w:tcPr>
-            <w:tcW w:w="503" w:type="dxa"/>
+            <w:tcW w:w="504" w:type="dxa"/>
             <w:tcBorders>
               <w:top w:val="nil"/>
             </w:tcBorders>
@@ -5741,7 +5898,7 @@
         </w:tc>
         <w:tc>
           <w:tcPr>
-            <w:tcW w:w="681" w:type="dxa"/>
+            <w:tcW w:w="680" w:type="dxa"/>
             <w:tcBorders>
               <w:top w:val="nil"/>
               <w:left w:val="single" w:sz="18" w:space="0" w:color="000000"/>
@@ -5774,14 +5931,13 @@
     <w:p>
       <w:pPr>
         <w:pStyle w:val="Normal"/>
+        <w:spacing w:before="0" w:after="160"/>
         <w:rPr>
           <w:rFonts w:ascii="Times New Roman" w:hAnsi="Times New Roman" w:cs="Times New Roman"/>
         </w:rPr>
       </w:pPr>
       <w:r>
-        <w:rPr>
-          <w:rFonts w:cs="Times New Roman" w:ascii="Times New Roman" w:hAnsi="Times New Roman"/>
-        </w:rPr>
+        <w:rPr/>
       </w:r>
       <w:r>
         <w:br w:type="page"/>
@@ -5803,9 +5959,9 @@
       </w:r>
     </w:p>
     <w:sectPr>
-      <w:footerReference w:type="even" r:id="rId2"/>
-      <w:footerReference w:type="default" r:id="rId3"/>
-      <w:footerReference w:type="first" r:id="rId4"/>
+      <w:footerReference w:type="even" r:id="rId4"/>
+      <w:footerReference w:type="default" r:id="rId5"/>
+      <w:footerReference w:type="first" r:id="rId6"/>
       <w:type w:val="nextPage"/>
       <w:pgSz w:w="11906" w:h="16838"/>
       <w:pgMar w:left="1417" w:right="1417" w:gutter="0" w:header="0" w:top="1417" w:footer="1417" w:bottom="2058"/>
@@ -5823,7 +5979,6 @@
   <w:p>
     <w:pPr>
       <w:pStyle w:val="Footer"/>
-      <w:suppressLineNumbers/>
       <w:spacing w:before="0" w:after="160"/>
       <w:rPr/>
     </w:pPr>
@@ -6613,6 +6768,13 @@
     </w:pPr>
     <w:rPr/>
   </w:style>
+  <w:style w:type="paragraph" w:styleId="Contenudecadre">
+    <w:name w:val="Contenu de cadre"/>
+    <w:basedOn w:val="Normal"/>
+    <w:qFormat/>
+    <w:pPr/>
+    <w:rPr/>
+  </w:style>
   <w:style w:type="numbering" w:styleId="Pasdeliste" w:default="1">
     <w:name w:val="Pas de liste"/>
     <w:uiPriority w:val="99"/>

</xml_diff>

<commit_message>
fix(document): supprimer les fichiers de verrouillage pour les modèles de documents cotations et d'inscription
</commit_message>
<xml_diff>
--- a/documents_templates/cotations-secondary.docx
+++ b/documents_templates/cotations-secondary.docx
@@ -5,9 +5,8 @@
     <w:p>
       <w:pPr>
         <w:pStyle w:val="Normal"/>
-        <w:rPr>
-          <w:rFonts w:ascii="Times New Roman" w:hAnsi="Times New Roman" w:cs="Times New Roman"/>
-        </w:rPr>
+        <w:jc w:val="left"/>
+        <w:rPr/>
       </w:pPr>
       <w:r>
         <w:rPr>
@@ -22,12 +21,7 @@
         <w:pStyle w:val="Normal"/>
         <w:spacing w:before="0" w:after="0"/>
         <w:jc w:val="center"/>
-        <w:rPr>
-          <w:b/>
-          <w:bCs/>
-          <w:sz w:val="20"/>
-          <w:szCs w:val="20"/>
-        </w:rPr>
+        <w:rPr/>
       </w:pPr>
       <w:r>
         <w:rPr>
@@ -40,11 +34,11 @@
         <w:drawing>
           <wp:anchor behindDoc="0" distT="0" distB="0" distL="114300" distR="114300" simplePos="0" locked="0" layoutInCell="0" allowOverlap="1" relativeHeight="2">
             <wp:simplePos x="0" y="0"/>
-            <wp:positionH relativeFrom="margin">
+            <wp:positionH relativeFrom="column">
               <wp:posOffset>-635</wp:posOffset>
             </wp:positionH>
-            <wp:positionV relativeFrom="margin">
-              <wp:posOffset>231140</wp:posOffset>
+            <wp:positionV relativeFrom="paragraph">
+              <wp:posOffset>50800</wp:posOffset>
             </wp:positionV>
             <wp:extent cx="575310" cy="555625"/>
             <wp:effectExtent l="0" t="0" r="0" b="0"/>
@@ -91,7 +85,7 @@
                   <wp:posOffset>5918200</wp:posOffset>
                 </wp:positionH>
                 <wp:positionV relativeFrom="margin">
-                  <wp:posOffset>228600</wp:posOffset>
+                  <wp:posOffset>-11430</wp:posOffset>
                 </wp:positionV>
                 <wp:extent cx="720090" cy="720090"/>
                 <wp:effectExtent l="0" t="0" r="0" b="0"/>
@@ -154,7 +148,7 @@
           </mc:Choice>
           <mc:Fallback>
             <w:pict>
-              <v:rect id="shape_0" ID="Cadre1" path="m0,0l-2147483645,0l-2147483645,-2147483646l0,-2147483646xe" fillcolor="white" stroked="t" o:allowincell="f" style="position:absolute;margin-left:466pt;margin-top:18pt;width:56.65pt;height:56.65pt;mso-wrap-style:square;v-text-anchor:top;mso-position-horizontal-relative:margin;mso-position-vertical-relative:margin">
+              <v:rect id="shape_0" ID="Cadre1" path="m0,0l-2147483645,0l-2147483645,-2147483646l0,-2147483646xe" fillcolor="white" stroked="t" o:allowincell="f" style="position:absolute;margin-left:466pt;margin-top:-0.9pt;width:56.65pt;height:56.65pt;mso-wrap-style:square;v-text-anchor:top;mso-position-horizontal-relative:margin;mso-position-vertical-relative:margin">
                 <v:fill o:detectmouseclick="t" type="solid" color2="black" opacity="0"/>
                 <v:stroke color="black" dashstyle="dash" joinstyle="round" endcap="flat"/>
                 <v:textbox>
@@ -233,14 +227,7 @@
         <w:pStyle w:val="Normal"/>
         <w:spacing w:before="0" w:after="0"/>
         <w:jc w:val="center"/>
-        <w:rPr>
-          <w:i/>
-          <w:i/>
-          <w:iCs/>
-          <w:sz w:val="18"/>
-          <w:szCs w:val="18"/>
-          <w:lang w:val="en-US"/>
-        </w:rPr>
+        <w:rPr/>
       </w:pPr>
       <w:r>
         <w:rPr>
@@ -426,7 +413,7 @@
                 <w:szCs w:val="22"/>
                 <w:lang w:val="fr-FR" w:eastAsia="en-US" w:bidi="ar-SA"/>
               </w:rPr>
-              <w:t>:</w:t>
+              <w:t>:…………………………………………………………………………………………...</w:t>
             </w:r>
           </w:p>
         </w:tc>
@@ -489,8 +476,6 @@
                 <w:sz w:val="20"/>
               </w:rPr>
             </w:pPr>
-            <w:bookmarkStart w:id="0" w:name="_GoBack"/>
-            <w:bookmarkEnd w:id="0"/>
             <w:r>
               <w:rPr>
                 <w:rFonts w:eastAsia="Calibri" w:cs="Times New Roman" w:ascii="Times New Roman" w:hAnsi="Times New Roman"/>
@@ -499,7 +484,7 @@
                 <w:szCs w:val="22"/>
                 <w:lang w:val="fr-FR" w:eastAsia="en-US" w:bidi="ar-SA"/>
               </w:rPr>
-              <w:t>:</w:t>
+              <w:t>:…………………………………………………………………………………………...</w:t>
             </w:r>
           </w:p>
         </w:tc>
@@ -570,7 +555,7 @@
                 <w:szCs w:val="22"/>
                 <w:lang w:val="fr-FR" w:eastAsia="en-US" w:bidi="ar-SA"/>
               </w:rPr>
-              <w:t>:</w:t>
+              <w:t>:…………………………………………………………………………………………...</w:t>
             </w:r>
           </w:p>
         </w:tc>
@@ -897,8 +882,8 @@
               <w:jc w:val="center"/>
               <w:rPr>
                 <w:rFonts w:ascii="Times New Roman" w:hAnsi="Times New Roman" w:cs="Times New Roman"/>
-                <w:sz w:val="20"/>
-                <w:szCs w:val="20"/>
+                <w:sz w:val="18"/>
+                <w:szCs w:val="18"/>
               </w:rPr>
             </w:pPr>
             <w:r>
@@ -909,7 +894,20 @@
                 <w:szCs w:val="20"/>
                 <w:lang w:val="fr-FR" w:eastAsia="en-US" w:bidi="ar-SA"/>
               </w:rPr>
-              <w:t>N◦</w:t>
+              <w:t>N</w:t>
+            </w:r>
+            <w:r>
+              <w:rPr>
+                <w:rFonts w:eastAsia="DejaVu Sans" w:cs="DejaVu Sans" w:ascii="Times New Roman" w:hAnsi="Times New Roman"/>
+                <w:kern w:val="0"/>
+                <w:position w:val="0"/>
+                <w:sz w:val="20"/>
+                <w:sz w:val="20"/>
+                <w:szCs w:val="20"/>
+                <w:vertAlign w:val="baseline"/>
+                <w:lang w:val="fr-FR" w:eastAsia="en-US" w:bidi="ar-SA"/>
+              </w:rPr>
+              <w:t>∘</w:t>
             </w:r>
           </w:p>
         </w:tc>

</xml_diff>

<commit_message>
feat: ajouter des fonctionnalités d'exportation de documents et de notifications
</commit_message>
<xml_diff>
--- a/documents_templates/cotations-secondary.docx
+++ b/documents_templates/cotations-secondary.docx
@@ -72,7 +72,7 @@
         <mc:AlternateContent>
           <mc:Choice Requires="wps">
             <w:drawing>
-              <wp:anchor behindDoc="0" distT="0" distB="0" distL="113030" distR="111760" simplePos="0" locked="0" layoutInCell="0" allowOverlap="1" relativeHeight="3">
+              <wp:anchor behindDoc="0" distT="0" distB="0" distL="112395" distR="110490" simplePos="0" locked="0" layoutInCell="0" allowOverlap="1" relativeHeight="3">
                 <wp:simplePos x="0" y="0"/>
                 <wp:positionH relativeFrom="margin">
                   <wp:posOffset>5918200</wp:posOffset>
@@ -233,7 +233,29 @@
           <w:szCs w:val="18"/>
           <w:lang w:val="en-US"/>
         </w:rPr>
-        <w:t>+++school.adress+++, +++school.town+++</w:t>
+        <w:t>+++school.ad</w:t>
+      </w:r>
+      <w:r>
+        <w:rPr>
+          <w:rFonts w:cs="Times New Roman" w:ascii="Times New Roman" w:hAnsi="Times New Roman"/>
+          <w:i/>
+          <w:iCs/>
+          <w:sz w:val="18"/>
+          <w:szCs w:val="18"/>
+          <w:lang w:val="en-US"/>
+        </w:rPr>
+        <w:t>d</w:t>
+      </w:r>
+      <w:r>
+        <w:rPr>
+          <w:rFonts w:cs="Times New Roman" w:ascii="Times New Roman" w:hAnsi="Times New Roman"/>
+          <w:i/>
+          <w:iCs/>
+          <w:sz w:val="18"/>
+          <w:szCs w:val="18"/>
+          <w:lang w:val="en-US"/>
+        </w:rPr>
+        <w:t>ress+++, +++school.town+++</w:t>
       </w:r>
     </w:p>
     <w:p>
@@ -268,14 +290,14 @@
         <w:tblLook w:val="04a0" w:noHBand="0" w:noVBand="1" w:firstColumn="1" w:lastRow="0" w:lastColumn="0" w:firstRow="1"/>
       </w:tblPr>
       <w:tblGrid>
-        <w:gridCol w:w="1948"/>
-        <w:gridCol w:w="7539"/>
+        <w:gridCol w:w="1947"/>
+        <w:gridCol w:w="7540"/>
       </w:tblGrid>
       <w:tr>
         <w:trPr/>
         <w:tc>
           <w:tcPr>
-            <w:tcW w:w="1948" w:type="dxa"/>
+            <w:tcW w:w="1947" w:type="dxa"/>
             <w:tcBorders>
               <w:top w:val="nil"/>
               <w:left w:val="nil"/>
@@ -309,7 +331,7 @@
         </w:tc>
         <w:tc>
           <w:tcPr>
-            <w:tcW w:w="7539" w:type="dxa"/>
+            <w:tcW w:w="7540" w:type="dxa"/>
             <w:tcBorders>
               <w:top w:val="nil"/>
               <w:left w:val="nil"/>
@@ -346,7 +368,7 @@
         <w:trPr/>
         <w:tc>
           <w:tcPr>
-            <w:tcW w:w="1948" w:type="dxa"/>
+            <w:tcW w:w="1947" w:type="dxa"/>
             <w:tcBorders>
               <w:top w:val="nil"/>
               <w:left w:val="nil"/>
@@ -380,7 +402,7 @@
         </w:tc>
         <w:tc>
           <w:tcPr>
-            <w:tcW w:w="7539" w:type="dxa"/>
+            <w:tcW w:w="7540" w:type="dxa"/>
             <w:tcBorders>
               <w:top w:val="nil"/>
               <w:left w:val="nil"/>
@@ -417,7 +439,7 @@
         <w:trPr/>
         <w:tc>
           <w:tcPr>
-            <w:tcW w:w="1948" w:type="dxa"/>
+            <w:tcW w:w="1947" w:type="dxa"/>
             <w:tcBorders>
               <w:top w:val="nil"/>
               <w:left w:val="nil"/>
@@ -451,7 +473,7 @@
         </w:tc>
         <w:tc>
           <w:tcPr>
-            <w:tcW w:w="7539" w:type="dxa"/>
+            <w:tcW w:w="7540" w:type="dxa"/>
             <w:tcBorders>
               <w:top w:val="nil"/>
               <w:left w:val="nil"/>
@@ -488,7 +510,7 @@
         <w:trPr/>
         <w:tc>
           <w:tcPr>
-            <w:tcW w:w="1948" w:type="dxa"/>
+            <w:tcW w:w="1947" w:type="dxa"/>
             <w:tcBorders>
               <w:top w:val="nil"/>
               <w:left w:val="nil"/>
@@ -522,7 +544,7 @@
         </w:tc>
         <w:tc>
           <w:tcPr>
-            <w:tcW w:w="7539" w:type="dxa"/>
+            <w:tcW w:w="7540" w:type="dxa"/>
             <w:tcBorders>
               <w:top w:val="nil"/>
               <w:left w:val="nil"/>
@@ -629,13 +651,13 @@
         <w:gridCol w:w="4078"/>
         <w:gridCol w:w="512"/>
         <w:gridCol w:w="508"/>
-        <w:gridCol w:w="909"/>
+        <w:gridCol w:w="910"/>
         <w:gridCol w:w="623"/>
         <w:gridCol w:w="500"/>
         <w:gridCol w:w="511"/>
         <w:gridCol w:w="906"/>
         <w:gridCol w:w="624"/>
-        <w:gridCol w:w="933"/>
+        <w:gridCol w:w="932"/>
       </w:tblGrid>
       <w:tr>
         <w:trPr/>
@@ -711,7 +733,7 @@
         </w:tc>
         <w:tc>
           <w:tcPr>
-            <w:tcW w:w="2552" w:type="dxa"/>
+            <w:tcW w:w="2553" w:type="dxa"/>
             <w:gridSpan w:val="4"/>
             <w:tcBorders>
               <w:left w:val="single" w:sz="18" w:space="0" w:color="000000"/>
@@ -823,7 +845,7 @@
         </w:tc>
         <w:tc>
           <w:tcPr>
-            <w:tcW w:w="933" w:type="dxa"/>
+            <w:tcW w:w="932" w:type="dxa"/>
             <w:tcBorders>
               <w:left w:val="single" w:sz="18" w:space="0" w:color="000000"/>
             </w:tcBorders>
@@ -1049,7 +1071,7 @@
         </w:tc>
         <w:tc>
           <w:tcPr>
-            <w:tcW w:w="909" w:type="dxa"/>
+            <w:tcW w:w="910" w:type="dxa"/>
             <w:tcBorders/>
             <w:vAlign w:val="center"/>
           </w:tcPr>
@@ -1283,7 +1305,7 @@
         </w:tc>
         <w:tc>
           <w:tcPr>
-            <w:tcW w:w="933" w:type="dxa"/>
+            <w:tcW w:w="932" w:type="dxa"/>
             <w:tcBorders>
               <w:left w:val="single" w:sz="18" w:space="0" w:color="000000"/>
             </w:tcBorders>
@@ -1442,7 +1464,7 @@
         </w:tc>
         <w:tc>
           <w:tcPr>
-            <w:tcW w:w="909" w:type="dxa"/>
+            <w:tcW w:w="910" w:type="dxa"/>
             <w:tcBorders>
               <w:bottom w:val="single" w:sz="18" w:space="0" w:color="000000"/>
             </w:tcBorders>
@@ -1625,7 +1647,7 @@
         </w:tc>
         <w:tc>
           <w:tcPr>
-            <w:tcW w:w="933" w:type="dxa"/>
+            <w:tcW w:w="932" w:type="dxa"/>
             <w:tcBorders>
               <w:left w:val="single" w:sz="18" w:space="0" w:color="000000"/>
               <w:bottom w:val="single" w:sz="18" w:space="0" w:color="000000"/>
@@ -1789,7 +1811,7 @@
         </w:tc>
         <w:tc>
           <w:tcPr>
-            <w:tcW w:w="909" w:type="dxa"/>
+            <w:tcW w:w="910" w:type="dxa"/>
             <w:tcBorders>
               <w:top w:val="single" w:sz="18" w:space="0" w:color="000000"/>
             </w:tcBorders>
@@ -1984,7 +2006,7 @@
         </w:tc>
         <w:tc>
           <w:tcPr>
-            <w:tcW w:w="933" w:type="dxa"/>
+            <w:tcW w:w="932" w:type="dxa"/>
             <w:tcBorders>
               <w:top w:val="single" w:sz="18" w:space="0" w:color="000000"/>
               <w:left w:val="single" w:sz="18" w:space="0" w:color="000000"/>
@@ -2145,7 +2167,7 @@
         </w:tc>
         <w:tc>
           <w:tcPr>
-            <w:tcW w:w="909" w:type="dxa"/>
+            <w:tcW w:w="910" w:type="dxa"/>
             <w:tcBorders/>
             <w:vAlign w:val="center"/>
           </w:tcPr>
@@ -2319,7 +2341,7 @@
         </w:tc>
         <w:tc>
           <w:tcPr>
-            <w:tcW w:w="933" w:type="dxa"/>
+            <w:tcW w:w="932" w:type="dxa"/>
             <w:tcBorders>
               <w:left w:val="single" w:sz="18" w:space="0" w:color="000000"/>
             </w:tcBorders>
@@ -2467,7 +2489,7 @@
         </w:tc>
         <w:tc>
           <w:tcPr>
-            <w:tcW w:w="909" w:type="dxa"/>
+            <w:tcW w:w="910" w:type="dxa"/>
             <w:tcBorders/>
           </w:tcPr>
           <w:p>
@@ -2635,7 +2657,7 @@
         </w:tc>
         <w:tc>
           <w:tcPr>
-            <w:tcW w:w="933" w:type="dxa"/>
+            <w:tcW w:w="932" w:type="dxa"/>
             <w:tcBorders>
               <w:left w:val="single" w:sz="18" w:space="0" w:color="000000"/>
             </w:tcBorders>
@@ -2786,7 +2808,7 @@
         </w:tc>
         <w:tc>
           <w:tcPr>
-            <w:tcW w:w="909" w:type="dxa"/>
+            <w:tcW w:w="910" w:type="dxa"/>
             <w:tcBorders>
               <w:top w:val="nil"/>
             </w:tcBorders>
@@ -2963,7 +2985,7 @@
         </w:tc>
         <w:tc>
           <w:tcPr>
-            <w:tcW w:w="933" w:type="dxa"/>
+            <w:tcW w:w="932" w:type="dxa"/>
             <w:tcBorders>
               <w:top w:val="nil"/>
               <w:left w:val="single" w:sz="18" w:space="0" w:color="000000"/>
@@ -3115,7 +3137,7 @@
         </w:tc>
         <w:tc>
           <w:tcPr>
-            <w:tcW w:w="909" w:type="dxa"/>
+            <w:tcW w:w="910" w:type="dxa"/>
             <w:tcBorders>
               <w:top w:val="nil"/>
             </w:tcBorders>
@@ -3292,7 +3314,7 @@
         </w:tc>
         <w:tc>
           <w:tcPr>
-            <w:tcW w:w="933" w:type="dxa"/>
+            <w:tcW w:w="932" w:type="dxa"/>
             <w:tcBorders>
               <w:top w:val="nil"/>
               <w:left w:val="single" w:sz="18" w:space="0" w:color="000000"/>
@@ -3444,7 +3466,7 @@
         </w:tc>
         <w:tc>
           <w:tcPr>
-            <w:tcW w:w="909" w:type="dxa"/>
+            <w:tcW w:w="910" w:type="dxa"/>
             <w:tcBorders>
               <w:top w:val="nil"/>
             </w:tcBorders>
@@ -3621,7 +3643,7 @@
         </w:tc>
         <w:tc>
           <w:tcPr>
-            <w:tcW w:w="933" w:type="dxa"/>
+            <w:tcW w:w="932" w:type="dxa"/>
             <w:tcBorders>
               <w:top w:val="nil"/>
               <w:left w:val="single" w:sz="18" w:space="0" w:color="000000"/>
@@ -3773,7 +3795,7 @@
         </w:tc>
         <w:tc>
           <w:tcPr>
-            <w:tcW w:w="909" w:type="dxa"/>
+            <w:tcW w:w="910" w:type="dxa"/>
             <w:tcBorders>
               <w:top w:val="nil"/>
             </w:tcBorders>
@@ -3950,7 +3972,7 @@
         </w:tc>
         <w:tc>
           <w:tcPr>
-            <w:tcW w:w="933" w:type="dxa"/>
+            <w:tcW w:w="932" w:type="dxa"/>
             <w:tcBorders>
               <w:top w:val="nil"/>
               <w:left w:val="single" w:sz="18" w:space="0" w:color="000000"/>
@@ -4102,7 +4124,7 @@
         </w:tc>
         <w:tc>
           <w:tcPr>
-            <w:tcW w:w="909" w:type="dxa"/>
+            <w:tcW w:w="910" w:type="dxa"/>
             <w:tcBorders>
               <w:top w:val="nil"/>
             </w:tcBorders>
@@ -4279,7 +4301,7 @@
         </w:tc>
         <w:tc>
           <w:tcPr>
-            <w:tcW w:w="933" w:type="dxa"/>
+            <w:tcW w:w="932" w:type="dxa"/>
             <w:tcBorders>
               <w:top w:val="nil"/>
               <w:left w:val="single" w:sz="18" w:space="0" w:color="000000"/>
@@ -4431,7 +4453,7 @@
         </w:tc>
         <w:tc>
           <w:tcPr>
-            <w:tcW w:w="909" w:type="dxa"/>
+            <w:tcW w:w="910" w:type="dxa"/>
             <w:tcBorders>
               <w:top w:val="nil"/>
             </w:tcBorders>
@@ -4608,7 +4630,7 @@
         </w:tc>
         <w:tc>
           <w:tcPr>
-            <w:tcW w:w="933" w:type="dxa"/>
+            <w:tcW w:w="932" w:type="dxa"/>
             <w:tcBorders>
               <w:top w:val="nil"/>
               <w:left w:val="single" w:sz="18" w:space="0" w:color="000000"/>
@@ -4760,7 +4782,7 @@
         </w:tc>
         <w:tc>
           <w:tcPr>
-            <w:tcW w:w="909" w:type="dxa"/>
+            <w:tcW w:w="910" w:type="dxa"/>
             <w:tcBorders>
               <w:top w:val="nil"/>
             </w:tcBorders>
@@ -4937,7 +4959,7 @@
         </w:tc>
         <w:tc>
           <w:tcPr>
-            <w:tcW w:w="933" w:type="dxa"/>
+            <w:tcW w:w="932" w:type="dxa"/>
             <w:tcBorders>
               <w:top w:val="nil"/>
               <w:left w:val="single" w:sz="18" w:space="0" w:color="000000"/>
@@ -5089,7 +5111,7 @@
         </w:tc>
         <w:tc>
           <w:tcPr>
-            <w:tcW w:w="909" w:type="dxa"/>
+            <w:tcW w:w="910" w:type="dxa"/>
             <w:tcBorders>
               <w:top w:val="nil"/>
             </w:tcBorders>
@@ -5266,7 +5288,7 @@
         </w:tc>
         <w:tc>
           <w:tcPr>
-            <w:tcW w:w="933" w:type="dxa"/>
+            <w:tcW w:w="932" w:type="dxa"/>
             <w:tcBorders>
               <w:top w:val="nil"/>
               <w:left w:val="single" w:sz="18" w:space="0" w:color="000000"/>
@@ -5418,7 +5440,7 @@
         </w:tc>
         <w:tc>
           <w:tcPr>
-            <w:tcW w:w="909" w:type="dxa"/>
+            <w:tcW w:w="910" w:type="dxa"/>
             <w:tcBorders>
               <w:top w:val="nil"/>
             </w:tcBorders>
@@ -5595,7 +5617,7 @@
         </w:tc>
         <w:tc>
           <w:tcPr>
-            <w:tcW w:w="933" w:type="dxa"/>
+            <w:tcW w:w="932" w:type="dxa"/>
             <w:tcBorders>
               <w:top w:val="nil"/>
               <w:left w:val="single" w:sz="18" w:space="0" w:color="000000"/>
@@ -5749,7 +5771,7 @@
         </w:tc>
         <w:tc>
           <w:tcPr>
-            <w:tcW w:w="909" w:type="dxa"/>
+            <w:tcW w:w="910" w:type="dxa"/>
             <w:tcBorders>
               <w:top w:val="nil"/>
             </w:tcBorders>
@@ -5926,7 +5948,7 @@
         </w:tc>
         <w:tc>
           <w:tcPr>
-            <w:tcW w:w="933" w:type="dxa"/>
+            <w:tcW w:w="932" w:type="dxa"/>
             <w:tcBorders>
               <w:top w:val="nil"/>
               <w:left w:val="single" w:sz="18" w:space="0" w:color="000000"/>

</xml_diff>